<commit_message>
docs: refresh ALP report with live evidence and Google auto-provision
- Re-captured all 17 scenarios from https://alp-cybersecurity.vercel.app
  (production) instead of localhost
- Re-captured /demo/authz screenshots for all 5 demo roles on production
- Added auto-provisioning note under Access Token section explaining the
  new Google OAuth flow (Donor record + 3 screenings + linkedId created
  automatically on first sign-in)
- Added demo account credentials table for evaluator reference
- Added 'Pembaruan terbaru' section summarizing latest changes
</commit_message>
<xml_diff>
--- a/Laporan-ALP-SistemOtorisasi-Ervandy-0706012414015.docx
+++ b/Laporan-ALP-SistemOtorisasi-Ervandy-0706012414015.docx
@@ -1713,7 +1713,7 @@
           <w:sz w:val="22"/>
           <w:szCs w:val="22"/>
         </w:rPr>
-        <w:t xml:space="preserve">Aplikasi menggunakan dua mekanisme access token:</w:t>
+        <w:t xml:space="preserve">Aplikasi menggunakan dua mekanisme access token, dan keduanya berujung pada Firebase ID token (JWT RS256) yang kemudian dilampirkan pada header Authorization Bearer di setiap panggilan API:</w:t>
       </w:r>
     </w:p>
     <w:p>
@@ -1729,7 +1729,7 @@
           <w:sz w:val="22"/>
           <w:szCs w:val="22"/>
         </w:rPr>
-        <w:t xml:space="preserve">JWT via email + password — Firebase Auth menerbitkan ID token RS256 saat signInWithEmailAndPassword. Token dilampirkan pada header Authorization Bearer.</w:t>
+        <w:t xml:space="preserve">JWT via email + password — signInWithEmailAndPassword menerbitkan ID token. Cocok untuk akun internal (admin, dokter, hospital_staff).</w:t>
       </w:r>
     </w:p>
     <w:p>
@@ -1745,7 +1745,7 @@
           <w:sz w:val="22"/>
           <w:szCs w:val="22"/>
         </w:rPr>
-        <w:t xml:space="preserve">OAuth 2.0 Google Login — tombol "Masuk dengan Google" pada halaman /login memakai GoogleAuthProvider via signInWithPopup. Pada login Google pertama, user otomatis dibuat sebagai donor.</w:t>
+        <w:t xml:space="preserve">OAuth 2.0 Google Login — tombol "Masuk dengan Google" pada halaman /login memakai GoogleAuthProvider via signInWithPopup. Setelah persetujuan di popup Google, aplikasi menerima credential yang ditukar menjadi Firebase ID token (sama dengan jalur email/password).</w:t>
       </w:r>
     </w:p>
     <w:p>
@@ -1760,10 +1760,30 @@
     <w:p>
       <w:r>
         <w:rPr>
+          <w:b/>
+          <w:bCs/>
           <w:sz w:val="22"/>
           <w:szCs w:val="22"/>
         </w:rPr>
-        <w:t xml:space="preserve">Endpoint /api/auth/me melakukan verifikasi tanda tangan JWT dan mengembalikan isi token (header + payload). Percobaan tanpa token akan ditolak dengan 401.</w:t>
+        <w:t xml:space="preserve">Auto-provisioning untuk Google user: pada login Google pertama, aplikasi otomatis membuat (a) record User dengan role=donor dan isEmailVerified=true (diturunkan dari Google), (b) record Donor dengan default value yang dapat dilengkapi di halaman profil, (c) tiga screening pending (satu per spesialisasi dokter), dan (d) menyetel user.linkedId ke donorId yang baru. Dengan demikian, user Google langsung bisa masuk ke dashboard donor tanpa harus mengisi ulang form registrasi.</w:t>
+      </w:r>
+    </w:p>
+    <w:p>
+      <w:r>
+        <w:rPr>
+          <w:sz w:val="22"/>
+          <w:szCs w:val="22"/>
+        </w:rPr>
+        <w:t xml:space="preserve"/>
+      </w:r>
+    </w:p>
+    <w:p>
+      <w:r>
+        <w:rPr>
+          <w:sz w:val="22"/>
+          <w:szCs w:val="22"/>
+        </w:rPr>
+        <w:t xml:space="preserve">Endpoint /api/auth/me melakukan verifikasi tanda tangan JWT (firebase-admin SDK) dan mengembalikan isi token (header + payload + claims). Percobaan tanpa token ditolak dengan 401.</w:t>
       </w:r>
     </w:p>
     <w:p>
@@ -1861,7 +1881,7 @@
           <w:sz w:val="26"/>
           <w:szCs w:val="26"/>
         </w:rPr>
-        <w:t xml:space="preserve">Decoded JWT untuk akun admin@demo.test</w:t>
+        <w:t xml:space="preserve">Decoded JWT untuk akun admin@demo.test (sign_in_provider: password)</w:t>
       </w:r>
     </w:p>
     <w:p>
@@ -2176,7 +2196,7 @@
           <w:sz w:val="18"/>
           <w:szCs w:val="18"/>
         </w:rPr>
-        <w:t xml:space="preserve">      "auth_time": 1776966175,</w:t>
+        <w:t xml:space="preserve">      "auth_time": 1776972841,</w:t>
       </w:r>
     </w:p>
     <w:p>
@@ -2221,22 +2241,22 @@
           <w:sz w:val="18"/>
           <w:szCs w:val="18"/>
         </w:rPr>
-        <w:t xml:space="preserve">      "iat": 1776966175,</w:t>
-      </w:r>
-    </w:p>
-    <w:p>
-      <w:pPr>
-        <w:shd w:fill="1F2937" w:val="clear"/>
-        <w:spacing w:after="0" w:before="0"/>
-      </w:pPr>
-      <w:r>
-        <w:rPr>
-          <w:rFonts w:ascii="Courier New" w:cs="Courier New" w:eastAsia="Courier New" w:hAnsi="Courier New"/>
-          <w:color w:val="F3F4F6"/>
-          <w:sz w:val="18"/>
-          <w:szCs w:val="18"/>
-        </w:rPr>
-        <w:t xml:space="preserve">      "exp": 1776969775,</w:t>
+        <w:t xml:space="preserve">      "iat": 1776972841,</w:t>
+      </w:r>
+    </w:p>
+    <w:p>
+      <w:pPr>
+        <w:shd w:fill="1F2937" w:val="clear"/>
+        <w:spacing w:after="0" w:before="0"/>
+      </w:pPr>
+      <w:r>
+        <w:rPr>
+          <w:rFonts w:ascii="Courier New" w:cs="Courier New" w:eastAsia="Courier New" w:hAnsi="Courier New"/>
+          <w:color w:val="F3F4F6"/>
+          <w:sz w:val="18"/>
+          <w:szCs w:val="18"/>
+        </w:rPr>
+        <w:t xml:space="preserve">      "exp": 1776976441,</w:t>
       </w:r>
     </w:p>
     <w:p>
@@ -2462,6 +2482,24 @@
           <w:szCs w:val="18"/>
         </w:rPr>
         <w:t xml:space="preserve">}</w:t>
+      </w:r>
+    </w:p>
+    <w:p>
+      <w:r>
+        <w:rPr>
+          <w:sz w:val="22"/>
+          <w:szCs w:val="22"/>
+        </w:rPr>
+        <w:t xml:space="preserve"/>
+      </w:r>
+    </w:p>
+    <w:p>
+      <w:r>
+        <w:rPr>
+          <w:sz w:val="22"/>
+          <w:szCs w:val="22"/>
+        </w:rPr>
+        <w:t xml:space="preserve">Pada field firebase.sign_in_provider di payload JWT, Google-signed-in user akan memiliki nilai "google.com" alih-alih "password" — sehingga server dapat membedakan sumber autentikasi jika diperlukan.</w:t>
       </w:r>
     </w:p>
     <w:p>
@@ -2887,6 +2925,171 @@
           <w:sz w:val="18"/>
           <w:szCs w:val="18"/>
         </w:rPr>
+        <w:t xml:space="preserve">      "id": "-OqvRYwkqL5QFL8zYH2v",</w:t>
+      </w:r>
+    </w:p>
+    <w:p>
+      <w:pPr>
+        <w:shd w:fill="1F2937" w:val="clear"/>
+        <w:spacing w:after="0" w:before="0"/>
+      </w:pPr>
+      <w:r>
+        <w:rPr>
+          <w:rFonts w:ascii="Courier New" w:cs="Courier New" w:eastAsia="Courier New" w:hAnsi="Courier New"/>
+          <w:color w:val="F3F4F6"/>
+          <w:sz w:val="18"/>
+          <w:szCs w:val="18"/>
+        </w:rPr>
+        <w:t xml:space="preserve">      "createdAt": "2026-04-23T17:45:20.058Z",</w:t>
+      </w:r>
+    </w:p>
+    <w:p>
+      <w:pPr>
+        <w:shd w:fill="1F2937" w:val="clear"/>
+        <w:spacing w:after="0" w:before="0"/>
+      </w:pPr>
+      <w:r>
+        <w:rPr>
+          <w:rFonts w:ascii="Courier New" w:cs="Courier New" w:eastAsia="Courier New" w:hAnsi="Courier New"/>
+          <w:color w:val="F3F4F6"/>
+          <w:sz w:val="18"/>
+          <w:szCs w:val="18"/>
+        </w:rPr>
+        <w:t xml:space="preserve">      "email": "demo@dr.test",</w:t>
+      </w:r>
+    </w:p>
+    <w:p>
+      <w:pPr>
+        <w:shd w:fill="1F2937" w:val="clear"/>
+        <w:spacing w:after="0" w:before="0"/>
+      </w:pPr>
+      <w:r>
+        <w:rPr>
+          <w:rFonts w:ascii="Courier New" w:cs="Courier New" w:eastAsia="Courier New" w:hAnsi="Courier New"/>
+          <w:color w:val="F3F4F6"/>
+          <w:sz w:val="18"/>
+          <w:szCs w:val="18"/>
+        </w:rPr>
+        <w:t xml:space="preserve">      "hospital": "RS Demo",</w:t>
+      </w:r>
+    </w:p>
+    <w:p>
+      <w:pPr>
+        <w:shd w:fill="1F2937" w:val="clear"/>
+        <w:spacing w:after="0" w:before="0"/>
+      </w:pPr>
+      <w:r>
+        <w:rPr>
+          <w:rFonts w:ascii="Courier New" w:cs="Courier New" w:eastAsia="Courier New" w:hAnsi="Courier New"/>
+          <w:color w:val="F3F4F6"/>
+          <w:sz w:val="18"/>
+          <w:szCs w:val="18"/>
+        </w:rPr>
+        <w:t xml:space="preserve">      "isActive": true,</w:t>
+      </w:r>
+    </w:p>
+    <w:p>
+      <w:pPr>
+        <w:shd w:fill="1F2937" w:val="clear"/>
+        <w:spacing w:after="0" w:before="0"/>
+      </w:pPr>
+      <w:r>
+        <w:rPr>
+          <w:rFonts w:ascii="Courier New" w:cs="Courier New" w:eastAsia="Courier New" w:hAnsi="Courier New"/>
+          <w:color w:val="F3F4F6"/>
+          <w:sz w:val="18"/>
+          <w:szCs w:val="18"/>
+        </w:rPr>
+        <w:t xml:space="preserve">      "licenseNumber": "DEMO-1776966319746",</w:t>
+      </w:r>
+    </w:p>
+    <w:p>
+      <w:pPr>
+        <w:shd w:fill="1F2937" w:val="clear"/>
+        <w:spacing w:after="0" w:before="0"/>
+      </w:pPr>
+      <w:r>
+        <w:rPr>
+          <w:rFonts w:ascii="Courier New" w:cs="Courier New" w:eastAsia="Courier New" w:hAnsi="Courier New"/>
+          <w:color w:val="F3F4F6"/>
+          <w:sz w:val="18"/>
+          <w:szCs w:val="18"/>
+        </w:rPr>
+        <w:t xml:space="preserve">      "name": "dr. Demo 1776966319746",</w:t>
+      </w:r>
+    </w:p>
+    <w:p>
+      <w:pPr>
+        <w:shd w:fill="1F2937" w:val="clear"/>
+        <w:spacing w:after="0" w:before="0"/>
+      </w:pPr>
+      <w:r>
+        <w:rPr>
+          <w:rFonts w:ascii="Courier New" w:cs="Courier New" w:eastAsia="Courier New" w:hAnsi="Courier New"/>
+          <w:color w:val="F3F4F6"/>
+          <w:sz w:val="18"/>
+          <w:szCs w:val="18"/>
+        </w:rPr>
+        <w:t xml:space="preserve">      "phone": "08123",</w:t>
+      </w:r>
+    </w:p>
+    <w:p>
+      <w:pPr>
+        <w:shd w:fill="1F2937" w:val="clear"/>
+        <w:spacing w:after="0" w:before="0"/>
+      </w:pPr>
+      <w:r>
+        <w:rPr>
+          <w:rFonts w:ascii="Courier New" w:cs="Courier New" w:eastAsia="Courier New" w:hAnsi="Courier New"/>
+          <w:color w:val="F3F4F6"/>
+          <w:sz w:val="18"/>
+          <w:szCs w:val="18"/>
+        </w:rPr>
+        <w:t xml:space="preserve">      "specialization": "SpPD-KGH"</w:t>
+      </w:r>
+    </w:p>
+    <w:p>
+      <w:pPr>
+        <w:shd w:fill="1F2937" w:val="clear"/>
+        <w:spacing w:after="0" w:before="0"/>
+      </w:pPr>
+      <w:r>
+        <w:rPr>
+          <w:rFonts w:ascii="Courier New" w:cs="Courier New" w:eastAsia="Courier New" w:hAnsi="Courier New"/>
+          <w:color w:val="F3F4F6"/>
+          <w:sz w:val="18"/>
+          <w:szCs w:val="18"/>
+        </w:rPr>
+        <w:t xml:space="preserve">    },</w:t>
+      </w:r>
+    </w:p>
+    <w:p>
+      <w:pPr>
+        <w:shd w:fill="1F2937" w:val="clear"/>
+        <w:spacing w:after="0" w:before="0"/>
+      </w:pPr>
+      <w:r>
+        <w:rPr>
+          <w:rFonts w:ascii="Courier New" w:cs="Courier New" w:eastAsia="Courier New" w:hAnsi="Courier New"/>
+          <w:color w:val="F3F4F6"/>
+          <w:sz w:val="18"/>
+          <w:szCs w:val="18"/>
+        </w:rPr>
+        <w:t xml:space="preserve">    {</w:t>
+      </w:r>
+    </w:p>
+    <w:p>
+      <w:pPr>
+        <w:shd w:fill="1F2937" w:val="clear"/>
+        <w:spacing w:after="0" w:before="0"/>
+      </w:pPr>
+      <w:r>
+        <w:rPr>
+          <w:rFonts w:ascii="Courier New" w:cs="Courier New" w:eastAsia="Courier New" w:hAnsi="Courier New"/>
+          <w:color w:val="F3F4F6"/>
+          <w:sz w:val="18"/>
+          <w:szCs w:val="18"/>
+        </w:rPr>
         <w:t xml:space="preserve">      "id": "doctor-1",</w:t>
       </w:r>
     </w:p>
@@ -3391,6 +3594,171 @@
           <w:szCs w:val="18"/>
         </w:rPr>
         <w:t xml:space="preserve">  "data": [</w:t>
+      </w:r>
+    </w:p>
+    <w:p>
+      <w:pPr>
+        <w:shd w:fill="1F2937" w:val="clear"/>
+        <w:spacing w:after="0" w:before="0"/>
+      </w:pPr>
+      <w:r>
+        <w:rPr>
+          <w:rFonts w:ascii="Courier New" w:cs="Courier New" w:eastAsia="Courier New" w:hAnsi="Courier New"/>
+          <w:color w:val="F3F4F6"/>
+          <w:sz w:val="18"/>
+          <w:szCs w:val="18"/>
+        </w:rPr>
+        <w:t xml:space="preserve">    {</w:t>
+      </w:r>
+    </w:p>
+    <w:p>
+      <w:pPr>
+        <w:shd w:fill="1F2937" w:val="clear"/>
+        <w:spacing w:after="0" w:before="0"/>
+      </w:pPr>
+      <w:r>
+        <w:rPr>
+          <w:rFonts w:ascii="Courier New" w:cs="Courier New" w:eastAsia="Courier New" w:hAnsi="Courier New"/>
+          <w:color w:val="F3F4F6"/>
+          <w:sz w:val="18"/>
+          <w:szCs w:val="18"/>
+        </w:rPr>
+        <w:t xml:space="preserve">      "id": "-OqvRYwkqL5QFL8zYH2v",</w:t>
+      </w:r>
+    </w:p>
+    <w:p>
+      <w:pPr>
+        <w:shd w:fill="1F2937" w:val="clear"/>
+        <w:spacing w:after="0" w:before="0"/>
+      </w:pPr>
+      <w:r>
+        <w:rPr>
+          <w:rFonts w:ascii="Courier New" w:cs="Courier New" w:eastAsia="Courier New" w:hAnsi="Courier New"/>
+          <w:color w:val="F3F4F6"/>
+          <w:sz w:val="18"/>
+          <w:szCs w:val="18"/>
+        </w:rPr>
+        <w:t xml:space="preserve">      "createdAt": "2026-04-23T17:45:20.058Z",</w:t>
+      </w:r>
+    </w:p>
+    <w:p>
+      <w:pPr>
+        <w:shd w:fill="1F2937" w:val="clear"/>
+        <w:spacing w:after="0" w:before="0"/>
+      </w:pPr>
+      <w:r>
+        <w:rPr>
+          <w:rFonts w:ascii="Courier New" w:cs="Courier New" w:eastAsia="Courier New" w:hAnsi="Courier New"/>
+          <w:color w:val="F3F4F6"/>
+          <w:sz w:val="18"/>
+          <w:szCs w:val="18"/>
+        </w:rPr>
+        <w:t xml:space="preserve">      "email": "demo@dr.test",</w:t>
+      </w:r>
+    </w:p>
+    <w:p>
+      <w:pPr>
+        <w:shd w:fill="1F2937" w:val="clear"/>
+        <w:spacing w:after="0" w:before="0"/>
+      </w:pPr>
+      <w:r>
+        <w:rPr>
+          <w:rFonts w:ascii="Courier New" w:cs="Courier New" w:eastAsia="Courier New" w:hAnsi="Courier New"/>
+          <w:color w:val="F3F4F6"/>
+          <w:sz w:val="18"/>
+          <w:szCs w:val="18"/>
+        </w:rPr>
+        <w:t xml:space="preserve">      "hospital": "RS Demo",</w:t>
+      </w:r>
+    </w:p>
+    <w:p>
+      <w:pPr>
+        <w:shd w:fill="1F2937" w:val="clear"/>
+        <w:spacing w:after="0" w:before="0"/>
+      </w:pPr>
+      <w:r>
+        <w:rPr>
+          <w:rFonts w:ascii="Courier New" w:cs="Courier New" w:eastAsia="Courier New" w:hAnsi="Courier New"/>
+          <w:color w:val="F3F4F6"/>
+          <w:sz w:val="18"/>
+          <w:szCs w:val="18"/>
+        </w:rPr>
+        <w:t xml:space="preserve">      "isActive": true,</w:t>
+      </w:r>
+    </w:p>
+    <w:p>
+      <w:pPr>
+        <w:shd w:fill="1F2937" w:val="clear"/>
+        <w:spacing w:after="0" w:before="0"/>
+      </w:pPr>
+      <w:r>
+        <w:rPr>
+          <w:rFonts w:ascii="Courier New" w:cs="Courier New" w:eastAsia="Courier New" w:hAnsi="Courier New"/>
+          <w:color w:val="F3F4F6"/>
+          <w:sz w:val="18"/>
+          <w:szCs w:val="18"/>
+        </w:rPr>
+        <w:t xml:space="preserve">      "licenseNumber": "DEMO-1776966319746",</w:t>
+      </w:r>
+    </w:p>
+    <w:p>
+      <w:pPr>
+        <w:shd w:fill="1F2937" w:val="clear"/>
+        <w:spacing w:after="0" w:before="0"/>
+      </w:pPr>
+      <w:r>
+        <w:rPr>
+          <w:rFonts w:ascii="Courier New" w:cs="Courier New" w:eastAsia="Courier New" w:hAnsi="Courier New"/>
+          <w:color w:val="F3F4F6"/>
+          <w:sz w:val="18"/>
+          <w:szCs w:val="18"/>
+        </w:rPr>
+        <w:t xml:space="preserve">      "name": "dr. Demo 1776966319746",</w:t>
+      </w:r>
+    </w:p>
+    <w:p>
+      <w:pPr>
+        <w:shd w:fill="1F2937" w:val="clear"/>
+        <w:spacing w:after="0" w:before="0"/>
+      </w:pPr>
+      <w:r>
+        <w:rPr>
+          <w:rFonts w:ascii="Courier New" w:cs="Courier New" w:eastAsia="Courier New" w:hAnsi="Courier New"/>
+          <w:color w:val="F3F4F6"/>
+          <w:sz w:val="18"/>
+          <w:szCs w:val="18"/>
+        </w:rPr>
+        <w:t xml:space="preserve">      "phone": "08123",</w:t>
+      </w:r>
+    </w:p>
+    <w:p>
+      <w:pPr>
+        <w:shd w:fill="1F2937" w:val="clear"/>
+        <w:spacing w:after="0" w:before="0"/>
+      </w:pPr>
+      <w:r>
+        <w:rPr>
+          <w:rFonts w:ascii="Courier New" w:cs="Courier New" w:eastAsia="Courier New" w:hAnsi="Courier New"/>
+          <w:color w:val="F3F4F6"/>
+          <w:sz w:val="18"/>
+          <w:szCs w:val="18"/>
+        </w:rPr>
+        <w:t xml:space="preserve">      "specialization": "SpPD-KGH"</w:t>
+      </w:r>
+    </w:p>
+    <w:p>
+      <w:pPr>
+        <w:shd w:fill="1F2937" w:val="clear"/>
+        <w:spacing w:after="0" w:before="0"/>
+      </w:pPr>
+      <w:r>
+        <w:rPr>
+          <w:rFonts w:ascii="Courier New" w:cs="Courier New" w:eastAsia="Courier New" w:hAnsi="Courier New"/>
+          <w:color w:val="F3F4F6"/>
+          <w:sz w:val="18"/>
+          <w:szCs w:val="18"/>
+        </w:rPr>
+        <w:t xml:space="preserve">    },</w:t>
       </w:r>
     </w:p>
     <w:p>
@@ -8515,7 +8883,7 @@
       </w:r>
     </w:p>
     <w:p>
-      <w:hyperlink w:history="1" r:id="rIdlo2q-aom3wbqqukyikuo8">
+      <w:hyperlink w:history="1" r:id="rId4c7s33jo6hun95ptmutuk">
         <w:r>
           <w:rPr>
             <w:rStyle w:val="Hyperlink"/>
@@ -8547,7 +8915,7 @@
       </w:r>
     </w:p>
     <w:p>
-      <w:hyperlink w:history="1" r:id="rIdy9widkuwwdwmwamwuv_7x">
+      <w:hyperlink w:history="1" r:id="rIdb2uilxzqu_iqntmb55vzw">
         <w:r>
           <w:rPr>
             <w:rStyle w:val="Hyperlink"/>
@@ -8577,7 +8945,7 @@
       </w:r>
     </w:p>
     <w:p>
-      <w:hyperlink w:history="1" r:id="rId2dm97rntn2vg41okwnq9f">
+      <w:hyperlink w:history="1" r:id="rIdhfbsot2eppn78mqpyucdo">
         <w:r>
           <w:rPr>
             <w:rStyle w:val="Hyperlink"/>
@@ -8587,6 +8955,906 @@
           <w:t xml:space="preserve">https://alp-cybersecurity.vercel.app/demo/authz</w:t>
         </w:r>
       </w:hyperlink>
+    </w:p>
+    <w:p>
+      <w:r>
+        <w:rPr>
+          <w:sz w:val="22"/>
+          <w:szCs w:val="22"/>
+        </w:rPr>
+        <w:t xml:space="preserve"/>
+      </w:r>
+    </w:p>
+    <w:p>
+      <w:pPr>
+        <w:pStyle w:val="Heading2"/>
+      </w:pPr>
+      <w:r>
+        <w:rPr>
+          <w:b/>
+          <w:bCs/>
+          <w:sz w:val="26"/>
+          <w:szCs w:val="26"/>
+        </w:rPr>
+        <w:t xml:space="preserve">Akun demo untuk pengujian</w:t>
+      </w:r>
+    </w:p>
+    <w:p>
+      <w:r>
+        <w:rPr>
+          <w:sz w:val="22"/>
+          <w:szCs w:val="22"/>
+        </w:rPr>
+        <w:t xml:space="preserve">Semua akun di bawah telah di-seed di Firebase project alp-cybersecurity-b38b3 (script: seed-authz-demo.js):</w:t>
+      </w:r>
+    </w:p>
+    <w:tbl>
+      <w:tblPr>
+        <w:tblW w:type="dxa" w:w="8200"/>
+        <w:tblBorders>
+          <w:top w:val="single" w:color="auto" w:sz="4"/>
+          <w:left w:val="single" w:color="auto" w:sz="4"/>
+          <w:bottom w:val="single" w:color="auto" w:sz="4"/>
+          <w:right w:val="single" w:color="auto" w:sz="4"/>
+          <w:insideH w:val="single" w:color="auto" w:sz="4"/>
+          <w:insideV w:val="single" w:color="auto" w:sz="4"/>
+        </w:tblBorders>
+      </w:tblPr>
+      <w:tblGrid>
+        <w:gridCol w:w="2600"/>
+        <w:gridCol w:w="1400"/>
+        <w:gridCol w:w="2200"/>
+        <w:gridCol w:w="2000"/>
+      </w:tblGrid>
+      <w:tr>
+        <w:tc>
+          <w:tcPr>
+            <w:tcW w:type="dxa" w:w="2600"/>
+            <w:tcBorders>
+              <w:top w:val="single" w:color="CCCCCC" w:sz="4"/>
+              <w:left w:val="single" w:color="CCCCCC" w:sz="4"/>
+              <w:bottom w:val="single" w:color="CCCCCC" w:sz="4"/>
+              <w:right w:val="single" w:color="CCCCCC" w:sz="4"/>
+            </w:tcBorders>
+            <w:shd w:fill="DBEAFE" w:val="clear"/>
+            <w:tcMar>
+              <w:top w:type="dxa" w:w="100"/>
+              <w:left w:type="dxa" w:w="160"/>
+              <w:bottom w:type="dxa" w:w="100"/>
+              <w:right w:type="dxa" w:w="160"/>
+            </w:tcMar>
+          </w:tcPr>
+          <w:p>
+            <w:r>
+              <w:rPr>
+                <w:b/>
+                <w:bCs/>
+                <w:sz w:val="20"/>
+                <w:szCs w:val="20"/>
+              </w:rPr>
+              <w:t xml:space="preserve">Email</w:t>
+            </w:r>
+          </w:p>
+        </w:tc>
+        <w:tc>
+          <w:tcPr>
+            <w:tcW w:type="dxa" w:w="1400"/>
+            <w:tcBorders>
+              <w:top w:val="single" w:color="CCCCCC" w:sz="4"/>
+              <w:left w:val="single" w:color="CCCCCC" w:sz="4"/>
+              <w:bottom w:val="single" w:color="CCCCCC" w:sz="4"/>
+              <w:right w:val="single" w:color="CCCCCC" w:sz="4"/>
+            </w:tcBorders>
+            <w:shd w:fill="DBEAFE" w:val="clear"/>
+            <w:tcMar>
+              <w:top w:type="dxa" w:w="100"/>
+              <w:left w:type="dxa" w:w="160"/>
+              <w:bottom w:type="dxa" w:w="100"/>
+              <w:right w:type="dxa" w:w="160"/>
+            </w:tcMar>
+          </w:tcPr>
+          <w:p>
+            <w:r>
+              <w:rPr>
+                <w:b/>
+                <w:bCs/>
+                <w:sz w:val="20"/>
+                <w:szCs w:val="20"/>
+              </w:rPr>
+              <w:t xml:space="preserve">Password</w:t>
+            </w:r>
+          </w:p>
+        </w:tc>
+        <w:tc>
+          <w:tcPr>
+            <w:tcW w:type="dxa" w:w="2200"/>
+            <w:tcBorders>
+              <w:top w:val="single" w:color="CCCCCC" w:sz="4"/>
+              <w:left w:val="single" w:color="CCCCCC" w:sz="4"/>
+              <w:bottom w:val="single" w:color="CCCCCC" w:sz="4"/>
+              <w:right w:val="single" w:color="CCCCCC" w:sz="4"/>
+            </w:tcBorders>
+            <w:shd w:fill="DBEAFE" w:val="clear"/>
+            <w:tcMar>
+              <w:top w:type="dxa" w:w="100"/>
+              <w:left w:type="dxa" w:w="160"/>
+              <w:bottom w:type="dxa" w:w="100"/>
+              <w:right w:type="dxa" w:w="160"/>
+            </w:tcMar>
+          </w:tcPr>
+          <w:p>
+            <w:r>
+              <w:rPr>
+                <w:b/>
+                <w:bCs/>
+                <w:sz w:val="20"/>
+                <w:szCs w:val="20"/>
+              </w:rPr>
+              <w:t xml:space="preserve">Role (RBAC)</w:t>
+            </w:r>
+          </w:p>
+        </w:tc>
+        <w:tc>
+          <w:tcPr>
+            <w:tcW w:type="dxa" w:w="2000"/>
+            <w:tcBorders>
+              <w:top w:val="single" w:color="CCCCCC" w:sz="4"/>
+              <w:left w:val="single" w:color="CCCCCC" w:sz="4"/>
+              <w:bottom w:val="single" w:color="CCCCCC" w:sz="4"/>
+              <w:right w:val="single" w:color="CCCCCC" w:sz="4"/>
+            </w:tcBorders>
+            <w:shd w:fill="DBEAFE" w:val="clear"/>
+            <w:tcMar>
+              <w:top w:type="dxa" w:w="100"/>
+              <w:left w:type="dxa" w:w="160"/>
+              <w:bottom w:type="dxa" w:w="100"/>
+              <w:right w:type="dxa" w:w="160"/>
+            </w:tcMar>
+          </w:tcPr>
+          <w:p>
+            <w:r>
+              <w:rPr>
+                <w:b/>
+                <w:bCs/>
+                <w:sz w:val="20"/>
+                <w:szCs w:val="20"/>
+              </w:rPr>
+              <w:t xml:space="preserve">linkedId (ABAC)</w:t>
+            </w:r>
+          </w:p>
+        </w:tc>
+      </w:tr>
+      <w:tr>
+        <w:tc>
+          <w:tcPr>
+            <w:tcW w:type="dxa" w:w="2600"/>
+            <w:tcBorders>
+              <w:top w:val="single" w:color="CCCCCC" w:sz="4"/>
+              <w:left w:val="single" w:color="CCCCCC" w:sz="4"/>
+              <w:bottom w:val="single" w:color="CCCCCC" w:sz="4"/>
+              <w:right w:val="single" w:color="CCCCCC" w:sz="4"/>
+            </w:tcBorders>
+            <w:tcMar>
+              <w:top w:type="dxa" w:w="100"/>
+              <w:left w:type="dxa" w:w="160"/>
+              <w:bottom w:type="dxa" w:w="100"/>
+              <w:right w:type="dxa" w:w="160"/>
+            </w:tcMar>
+          </w:tcPr>
+          <w:p>
+            <w:r>
+              <w:rPr>
+                <w:rFonts w:ascii="Courier New" w:cs="Courier New" w:eastAsia="Courier New" w:hAnsi="Courier New"/>
+                <w:sz w:val="20"/>
+                <w:szCs w:val="20"/>
+              </w:rPr>
+              <w:t xml:space="preserve">admin@demo.test</w:t>
+            </w:r>
+          </w:p>
+        </w:tc>
+        <w:tc>
+          <w:tcPr>
+            <w:tcW w:type="dxa" w:w="1400"/>
+            <w:tcBorders>
+              <w:top w:val="single" w:color="CCCCCC" w:sz="4"/>
+              <w:left w:val="single" w:color="CCCCCC" w:sz="4"/>
+              <w:bottom w:val="single" w:color="CCCCCC" w:sz="4"/>
+              <w:right w:val="single" w:color="CCCCCC" w:sz="4"/>
+            </w:tcBorders>
+            <w:tcMar>
+              <w:top w:type="dxa" w:w="100"/>
+              <w:left w:type="dxa" w:w="160"/>
+              <w:bottom w:type="dxa" w:w="100"/>
+              <w:right w:type="dxa" w:w="160"/>
+            </w:tcMar>
+          </w:tcPr>
+          <w:p>
+            <w:r>
+              <w:rPr>
+                <w:rFonts w:ascii="Courier New" w:cs="Courier New" w:eastAsia="Courier New" w:hAnsi="Courier New"/>
+                <w:sz w:val="20"/>
+                <w:szCs w:val="20"/>
+              </w:rPr>
+              <w:t xml:space="preserve">Admin@123</w:t>
+            </w:r>
+          </w:p>
+        </w:tc>
+        <w:tc>
+          <w:tcPr>
+            <w:tcW w:type="dxa" w:w="2200"/>
+            <w:tcBorders>
+              <w:top w:val="single" w:color="CCCCCC" w:sz="4"/>
+              <w:left w:val="single" w:color="CCCCCC" w:sz="4"/>
+              <w:bottom w:val="single" w:color="CCCCCC" w:sz="4"/>
+              <w:right w:val="single" w:color="CCCCCC" w:sz="4"/>
+            </w:tcBorders>
+            <w:tcMar>
+              <w:top w:type="dxa" w:w="100"/>
+              <w:left w:type="dxa" w:w="160"/>
+              <w:bottom w:type="dxa" w:w="100"/>
+              <w:right w:type="dxa" w:w="160"/>
+            </w:tcMar>
+          </w:tcPr>
+          <w:p>
+            <w:r>
+              <w:rPr>
+                <w:rFonts w:ascii="Arial" w:cs="Arial" w:eastAsia="Arial" w:hAnsi="Arial"/>
+                <w:sz w:val="20"/>
+                <w:szCs w:val="20"/>
+              </w:rPr>
+              <w:t xml:space="preserve">admin</w:t>
+            </w:r>
+          </w:p>
+        </w:tc>
+        <w:tc>
+          <w:tcPr>
+            <w:tcW w:type="dxa" w:w="2000"/>
+            <w:tcBorders>
+              <w:top w:val="single" w:color="CCCCCC" w:sz="4"/>
+              <w:left w:val="single" w:color="CCCCCC" w:sz="4"/>
+              <w:bottom w:val="single" w:color="CCCCCC" w:sz="4"/>
+              <w:right w:val="single" w:color="CCCCCC" w:sz="4"/>
+            </w:tcBorders>
+            <w:tcMar>
+              <w:top w:type="dxa" w:w="100"/>
+              <w:left w:type="dxa" w:w="160"/>
+              <w:bottom w:type="dxa" w:w="100"/>
+              <w:right w:type="dxa" w:w="160"/>
+            </w:tcMar>
+          </w:tcPr>
+          <w:p>
+            <w:r>
+              <w:rPr>
+                <w:rFonts w:ascii="Arial" w:cs="Arial" w:eastAsia="Arial" w:hAnsi="Arial"/>
+                <w:sz w:val="20"/>
+                <w:szCs w:val="20"/>
+              </w:rPr>
+              <w:t xml:space="preserve">—</w:t>
+            </w:r>
+          </w:p>
+        </w:tc>
+      </w:tr>
+      <w:tr>
+        <w:tc>
+          <w:tcPr>
+            <w:tcW w:type="dxa" w:w="2600"/>
+            <w:tcBorders>
+              <w:top w:val="single" w:color="CCCCCC" w:sz="4"/>
+              <w:left w:val="single" w:color="CCCCCC" w:sz="4"/>
+              <w:bottom w:val="single" w:color="CCCCCC" w:sz="4"/>
+              <w:right w:val="single" w:color="CCCCCC" w:sz="4"/>
+            </w:tcBorders>
+            <w:tcMar>
+              <w:top w:type="dxa" w:w="100"/>
+              <w:left w:type="dxa" w:w="160"/>
+              <w:bottom w:type="dxa" w:w="100"/>
+              <w:right w:type="dxa" w:w="160"/>
+            </w:tcMar>
+          </w:tcPr>
+          <w:p>
+            <w:r>
+              <w:rPr>
+                <w:rFonts w:ascii="Courier New" w:cs="Courier New" w:eastAsia="Courier New" w:hAnsi="Courier New"/>
+                <w:sz w:val="20"/>
+                <w:szCs w:val="20"/>
+              </w:rPr>
+              <w:t xml:space="preserve">doctor1@demo.test</w:t>
+            </w:r>
+          </w:p>
+        </w:tc>
+        <w:tc>
+          <w:tcPr>
+            <w:tcW w:type="dxa" w:w="1400"/>
+            <w:tcBorders>
+              <w:top w:val="single" w:color="CCCCCC" w:sz="4"/>
+              <w:left w:val="single" w:color="CCCCCC" w:sz="4"/>
+              <w:bottom w:val="single" w:color="CCCCCC" w:sz="4"/>
+              <w:right w:val="single" w:color="CCCCCC" w:sz="4"/>
+            </w:tcBorders>
+            <w:tcMar>
+              <w:top w:type="dxa" w:w="100"/>
+              <w:left w:type="dxa" w:w="160"/>
+              <w:bottom w:type="dxa" w:w="100"/>
+              <w:right w:type="dxa" w:w="160"/>
+            </w:tcMar>
+          </w:tcPr>
+          <w:p>
+            <w:r>
+              <w:rPr>
+                <w:rFonts w:ascii="Courier New" w:cs="Courier New" w:eastAsia="Courier New" w:hAnsi="Courier New"/>
+                <w:sz w:val="20"/>
+                <w:szCs w:val="20"/>
+              </w:rPr>
+              <w:t xml:space="preserve">Doctor@123</w:t>
+            </w:r>
+          </w:p>
+        </w:tc>
+        <w:tc>
+          <w:tcPr>
+            <w:tcW w:type="dxa" w:w="2200"/>
+            <w:tcBorders>
+              <w:top w:val="single" w:color="CCCCCC" w:sz="4"/>
+              <w:left w:val="single" w:color="CCCCCC" w:sz="4"/>
+              <w:bottom w:val="single" w:color="CCCCCC" w:sz="4"/>
+              <w:right w:val="single" w:color="CCCCCC" w:sz="4"/>
+            </w:tcBorders>
+            <w:tcMar>
+              <w:top w:type="dxa" w:w="100"/>
+              <w:left w:type="dxa" w:w="160"/>
+              <w:bottom w:type="dxa" w:w="100"/>
+              <w:right w:type="dxa" w:w="160"/>
+            </w:tcMar>
+          </w:tcPr>
+          <w:p>
+            <w:r>
+              <w:rPr>
+                <w:rFonts w:ascii="Arial" w:cs="Arial" w:eastAsia="Arial" w:hAnsi="Arial"/>
+                <w:sz w:val="20"/>
+                <w:szCs w:val="20"/>
+              </w:rPr>
+              <w:t xml:space="preserve">doctor</w:t>
+            </w:r>
+          </w:p>
+        </w:tc>
+        <w:tc>
+          <w:tcPr>
+            <w:tcW w:type="dxa" w:w="2000"/>
+            <w:tcBorders>
+              <w:top w:val="single" w:color="CCCCCC" w:sz="4"/>
+              <w:left w:val="single" w:color="CCCCCC" w:sz="4"/>
+              <w:bottom w:val="single" w:color="CCCCCC" w:sz="4"/>
+              <w:right w:val="single" w:color="CCCCCC" w:sz="4"/>
+            </w:tcBorders>
+            <w:tcMar>
+              <w:top w:type="dxa" w:w="100"/>
+              <w:left w:type="dxa" w:w="160"/>
+              <w:bottom w:type="dxa" w:w="100"/>
+              <w:right w:type="dxa" w:w="160"/>
+            </w:tcMar>
+          </w:tcPr>
+          <w:p>
+            <w:r>
+              <w:rPr>
+                <w:rFonts w:ascii="Arial" w:cs="Arial" w:eastAsia="Arial" w:hAnsi="Arial"/>
+                <w:sz w:val="20"/>
+                <w:szCs w:val="20"/>
+              </w:rPr>
+              <w:t xml:space="preserve">doctor-1</w:t>
+            </w:r>
+          </w:p>
+        </w:tc>
+      </w:tr>
+      <w:tr>
+        <w:tc>
+          <w:tcPr>
+            <w:tcW w:type="dxa" w:w="2600"/>
+            <w:tcBorders>
+              <w:top w:val="single" w:color="CCCCCC" w:sz="4"/>
+              <w:left w:val="single" w:color="CCCCCC" w:sz="4"/>
+              <w:bottom w:val="single" w:color="CCCCCC" w:sz="4"/>
+              <w:right w:val="single" w:color="CCCCCC" w:sz="4"/>
+            </w:tcBorders>
+            <w:tcMar>
+              <w:top w:type="dxa" w:w="100"/>
+              <w:left w:type="dxa" w:w="160"/>
+              <w:bottom w:type="dxa" w:w="100"/>
+              <w:right w:type="dxa" w:w="160"/>
+            </w:tcMar>
+          </w:tcPr>
+          <w:p>
+            <w:r>
+              <w:rPr>
+                <w:rFonts w:ascii="Courier New" w:cs="Courier New" w:eastAsia="Courier New" w:hAnsi="Courier New"/>
+                <w:sz w:val="20"/>
+                <w:szCs w:val="20"/>
+              </w:rPr>
+              <w:t xml:space="preserve">doctor2@demo.test</w:t>
+            </w:r>
+          </w:p>
+        </w:tc>
+        <w:tc>
+          <w:tcPr>
+            <w:tcW w:type="dxa" w:w="1400"/>
+            <w:tcBorders>
+              <w:top w:val="single" w:color="CCCCCC" w:sz="4"/>
+              <w:left w:val="single" w:color="CCCCCC" w:sz="4"/>
+              <w:bottom w:val="single" w:color="CCCCCC" w:sz="4"/>
+              <w:right w:val="single" w:color="CCCCCC" w:sz="4"/>
+            </w:tcBorders>
+            <w:tcMar>
+              <w:top w:type="dxa" w:w="100"/>
+              <w:left w:type="dxa" w:w="160"/>
+              <w:bottom w:type="dxa" w:w="100"/>
+              <w:right w:type="dxa" w:w="160"/>
+            </w:tcMar>
+          </w:tcPr>
+          <w:p>
+            <w:r>
+              <w:rPr>
+                <w:rFonts w:ascii="Courier New" w:cs="Courier New" w:eastAsia="Courier New" w:hAnsi="Courier New"/>
+                <w:sz w:val="20"/>
+                <w:szCs w:val="20"/>
+              </w:rPr>
+              <w:t xml:space="preserve">Doctor@123</w:t>
+            </w:r>
+          </w:p>
+        </w:tc>
+        <w:tc>
+          <w:tcPr>
+            <w:tcW w:type="dxa" w:w="2200"/>
+            <w:tcBorders>
+              <w:top w:val="single" w:color="CCCCCC" w:sz="4"/>
+              <w:left w:val="single" w:color="CCCCCC" w:sz="4"/>
+              <w:bottom w:val="single" w:color="CCCCCC" w:sz="4"/>
+              <w:right w:val="single" w:color="CCCCCC" w:sz="4"/>
+            </w:tcBorders>
+            <w:tcMar>
+              <w:top w:type="dxa" w:w="100"/>
+              <w:left w:type="dxa" w:w="160"/>
+              <w:bottom w:type="dxa" w:w="100"/>
+              <w:right w:type="dxa" w:w="160"/>
+            </w:tcMar>
+          </w:tcPr>
+          <w:p>
+            <w:r>
+              <w:rPr>
+                <w:rFonts w:ascii="Arial" w:cs="Arial" w:eastAsia="Arial" w:hAnsi="Arial"/>
+                <w:sz w:val="20"/>
+                <w:szCs w:val="20"/>
+              </w:rPr>
+              <w:t xml:space="preserve">doctor</w:t>
+            </w:r>
+          </w:p>
+        </w:tc>
+        <w:tc>
+          <w:tcPr>
+            <w:tcW w:type="dxa" w:w="2000"/>
+            <w:tcBorders>
+              <w:top w:val="single" w:color="CCCCCC" w:sz="4"/>
+              <w:left w:val="single" w:color="CCCCCC" w:sz="4"/>
+              <w:bottom w:val="single" w:color="CCCCCC" w:sz="4"/>
+              <w:right w:val="single" w:color="CCCCCC" w:sz="4"/>
+            </w:tcBorders>
+            <w:tcMar>
+              <w:top w:type="dxa" w:w="100"/>
+              <w:left w:type="dxa" w:w="160"/>
+              <w:bottom w:type="dxa" w:w="100"/>
+              <w:right w:type="dxa" w:w="160"/>
+            </w:tcMar>
+          </w:tcPr>
+          <w:p>
+            <w:r>
+              <w:rPr>
+                <w:rFonts w:ascii="Arial" w:cs="Arial" w:eastAsia="Arial" w:hAnsi="Arial"/>
+                <w:sz w:val="20"/>
+                <w:szCs w:val="20"/>
+              </w:rPr>
+              <w:t xml:space="preserve">doctor-2</w:t>
+            </w:r>
+          </w:p>
+        </w:tc>
+      </w:tr>
+      <w:tr>
+        <w:tc>
+          <w:tcPr>
+            <w:tcW w:type="dxa" w:w="2600"/>
+            <w:tcBorders>
+              <w:top w:val="single" w:color="CCCCCC" w:sz="4"/>
+              <w:left w:val="single" w:color="CCCCCC" w:sz="4"/>
+              <w:bottom w:val="single" w:color="CCCCCC" w:sz="4"/>
+              <w:right w:val="single" w:color="CCCCCC" w:sz="4"/>
+            </w:tcBorders>
+            <w:tcMar>
+              <w:top w:type="dxa" w:w="100"/>
+              <w:left w:type="dxa" w:w="160"/>
+              <w:bottom w:type="dxa" w:w="100"/>
+              <w:right w:type="dxa" w:w="160"/>
+            </w:tcMar>
+          </w:tcPr>
+          <w:p>
+            <w:r>
+              <w:rPr>
+                <w:rFonts w:ascii="Courier New" w:cs="Courier New" w:eastAsia="Courier New" w:hAnsi="Courier New"/>
+                <w:sz w:val="20"/>
+                <w:szCs w:val="20"/>
+              </w:rPr>
+              <w:t xml:space="preserve">staffA@demo.test</w:t>
+            </w:r>
+          </w:p>
+        </w:tc>
+        <w:tc>
+          <w:tcPr>
+            <w:tcW w:type="dxa" w:w="1400"/>
+            <w:tcBorders>
+              <w:top w:val="single" w:color="CCCCCC" w:sz="4"/>
+              <w:left w:val="single" w:color="CCCCCC" w:sz="4"/>
+              <w:bottom w:val="single" w:color="CCCCCC" w:sz="4"/>
+              <w:right w:val="single" w:color="CCCCCC" w:sz="4"/>
+            </w:tcBorders>
+            <w:tcMar>
+              <w:top w:type="dxa" w:w="100"/>
+              <w:left w:type="dxa" w:w="160"/>
+              <w:bottom w:type="dxa" w:w="100"/>
+              <w:right w:type="dxa" w:w="160"/>
+            </w:tcMar>
+          </w:tcPr>
+          <w:p>
+            <w:r>
+              <w:rPr>
+                <w:rFonts w:ascii="Courier New" w:cs="Courier New" w:eastAsia="Courier New" w:hAnsi="Courier New"/>
+                <w:sz w:val="20"/>
+                <w:szCs w:val="20"/>
+              </w:rPr>
+              <w:t xml:space="preserve">Staff@123</w:t>
+            </w:r>
+          </w:p>
+        </w:tc>
+        <w:tc>
+          <w:tcPr>
+            <w:tcW w:type="dxa" w:w="2200"/>
+            <w:tcBorders>
+              <w:top w:val="single" w:color="CCCCCC" w:sz="4"/>
+              <w:left w:val="single" w:color="CCCCCC" w:sz="4"/>
+              <w:bottom w:val="single" w:color="CCCCCC" w:sz="4"/>
+              <w:right w:val="single" w:color="CCCCCC" w:sz="4"/>
+            </w:tcBorders>
+            <w:tcMar>
+              <w:top w:type="dxa" w:w="100"/>
+              <w:left w:type="dxa" w:w="160"/>
+              <w:bottom w:type="dxa" w:w="100"/>
+              <w:right w:type="dxa" w:w="160"/>
+            </w:tcMar>
+          </w:tcPr>
+          <w:p>
+            <w:r>
+              <w:rPr>
+                <w:rFonts w:ascii="Arial" w:cs="Arial" w:eastAsia="Arial" w:hAnsi="Arial"/>
+                <w:sz w:val="20"/>
+                <w:szCs w:val="20"/>
+              </w:rPr>
+              <w:t xml:space="preserve">hospital_staff</w:t>
+            </w:r>
+          </w:p>
+        </w:tc>
+        <w:tc>
+          <w:tcPr>
+            <w:tcW w:type="dxa" w:w="2000"/>
+            <w:tcBorders>
+              <w:top w:val="single" w:color="CCCCCC" w:sz="4"/>
+              <w:left w:val="single" w:color="CCCCCC" w:sz="4"/>
+              <w:bottom w:val="single" w:color="CCCCCC" w:sz="4"/>
+              <w:right w:val="single" w:color="CCCCCC" w:sz="4"/>
+            </w:tcBorders>
+            <w:tcMar>
+              <w:top w:type="dxa" w:w="100"/>
+              <w:left w:type="dxa" w:w="160"/>
+              <w:bottom w:type="dxa" w:w="100"/>
+              <w:right w:type="dxa" w:w="160"/>
+            </w:tcMar>
+          </w:tcPr>
+          <w:p>
+            <w:r>
+              <w:rPr>
+                <w:rFonts w:ascii="Arial" w:cs="Arial" w:eastAsia="Arial" w:hAnsi="Arial"/>
+                <w:sz w:val="20"/>
+                <w:szCs w:val="20"/>
+              </w:rPr>
+              <w:t xml:space="preserve">hospital-A</w:t>
+            </w:r>
+          </w:p>
+        </w:tc>
+      </w:tr>
+      <w:tr>
+        <w:tc>
+          <w:tcPr>
+            <w:tcW w:type="dxa" w:w="2600"/>
+            <w:tcBorders>
+              <w:top w:val="single" w:color="CCCCCC" w:sz="4"/>
+              <w:left w:val="single" w:color="CCCCCC" w:sz="4"/>
+              <w:bottom w:val="single" w:color="CCCCCC" w:sz="4"/>
+              <w:right w:val="single" w:color="CCCCCC" w:sz="4"/>
+            </w:tcBorders>
+            <w:tcMar>
+              <w:top w:type="dxa" w:w="100"/>
+              <w:left w:type="dxa" w:w="160"/>
+              <w:bottom w:type="dxa" w:w="100"/>
+              <w:right w:type="dxa" w:w="160"/>
+            </w:tcMar>
+          </w:tcPr>
+          <w:p>
+            <w:r>
+              <w:rPr>
+                <w:rFonts w:ascii="Courier New" w:cs="Courier New" w:eastAsia="Courier New" w:hAnsi="Courier New"/>
+                <w:sz w:val="20"/>
+                <w:szCs w:val="20"/>
+              </w:rPr>
+              <w:t xml:space="preserve">staffB@demo.test</w:t>
+            </w:r>
+          </w:p>
+        </w:tc>
+        <w:tc>
+          <w:tcPr>
+            <w:tcW w:type="dxa" w:w="1400"/>
+            <w:tcBorders>
+              <w:top w:val="single" w:color="CCCCCC" w:sz="4"/>
+              <w:left w:val="single" w:color="CCCCCC" w:sz="4"/>
+              <w:bottom w:val="single" w:color="CCCCCC" w:sz="4"/>
+              <w:right w:val="single" w:color="CCCCCC" w:sz="4"/>
+            </w:tcBorders>
+            <w:tcMar>
+              <w:top w:type="dxa" w:w="100"/>
+              <w:left w:type="dxa" w:w="160"/>
+              <w:bottom w:type="dxa" w:w="100"/>
+              <w:right w:type="dxa" w:w="160"/>
+            </w:tcMar>
+          </w:tcPr>
+          <w:p>
+            <w:r>
+              <w:rPr>
+                <w:rFonts w:ascii="Courier New" w:cs="Courier New" w:eastAsia="Courier New" w:hAnsi="Courier New"/>
+                <w:sz w:val="20"/>
+                <w:szCs w:val="20"/>
+              </w:rPr>
+              <w:t xml:space="preserve">Staff@123</w:t>
+            </w:r>
+          </w:p>
+        </w:tc>
+        <w:tc>
+          <w:tcPr>
+            <w:tcW w:type="dxa" w:w="2200"/>
+            <w:tcBorders>
+              <w:top w:val="single" w:color="CCCCCC" w:sz="4"/>
+              <w:left w:val="single" w:color="CCCCCC" w:sz="4"/>
+              <w:bottom w:val="single" w:color="CCCCCC" w:sz="4"/>
+              <w:right w:val="single" w:color="CCCCCC" w:sz="4"/>
+            </w:tcBorders>
+            <w:tcMar>
+              <w:top w:type="dxa" w:w="100"/>
+              <w:left w:type="dxa" w:w="160"/>
+              <w:bottom w:type="dxa" w:w="100"/>
+              <w:right w:type="dxa" w:w="160"/>
+            </w:tcMar>
+          </w:tcPr>
+          <w:p>
+            <w:r>
+              <w:rPr>
+                <w:rFonts w:ascii="Arial" w:cs="Arial" w:eastAsia="Arial" w:hAnsi="Arial"/>
+                <w:sz w:val="20"/>
+                <w:szCs w:val="20"/>
+              </w:rPr>
+              <w:t xml:space="preserve">hospital_staff</w:t>
+            </w:r>
+          </w:p>
+        </w:tc>
+        <w:tc>
+          <w:tcPr>
+            <w:tcW w:type="dxa" w:w="2000"/>
+            <w:tcBorders>
+              <w:top w:val="single" w:color="CCCCCC" w:sz="4"/>
+              <w:left w:val="single" w:color="CCCCCC" w:sz="4"/>
+              <w:bottom w:val="single" w:color="CCCCCC" w:sz="4"/>
+              <w:right w:val="single" w:color="CCCCCC" w:sz="4"/>
+            </w:tcBorders>
+            <w:tcMar>
+              <w:top w:type="dxa" w:w="100"/>
+              <w:left w:type="dxa" w:w="160"/>
+              <w:bottom w:type="dxa" w:w="100"/>
+              <w:right w:type="dxa" w:w="160"/>
+            </w:tcMar>
+          </w:tcPr>
+          <w:p>
+            <w:r>
+              <w:rPr>
+                <w:rFonts w:ascii="Arial" w:cs="Arial" w:eastAsia="Arial" w:hAnsi="Arial"/>
+                <w:sz w:val="20"/>
+                <w:szCs w:val="20"/>
+              </w:rPr>
+              <w:t xml:space="preserve">hospital-B</w:t>
+            </w:r>
+          </w:p>
+        </w:tc>
+      </w:tr>
+      <w:tr>
+        <w:tc>
+          <w:tcPr>
+            <w:tcW w:type="dxa" w:w="2600"/>
+            <w:tcBorders>
+              <w:top w:val="single" w:color="CCCCCC" w:sz="4"/>
+              <w:left w:val="single" w:color="CCCCCC" w:sz="4"/>
+              <w:bottom w:val="single" w:color="CCCCCC" w:sz="4"/>
+              <w:right w:val="single" w:color="CCCCCC" w:sz="4"/>
+            </w:tcBorders>
+            <w:tcMar>
+              <w:top w:type="dxa" w:w="100"/>
+              <w:left w:type="dxa" w:w="160"/>
+              <w:bottom w:type="dxa" w:w="100"/>
+              <w:right w:type="dxa" w:w="160"/>
+            </w:tcMar>
+          </w:tcPr>
+          <w:p>
+            <w:r>
+              <w:rPr>
+                <w:rFonts w:ascii="Courier New" w:cs="Courier New" w:eastAsia="Courier New" w:hAnsi="Courier New"/>
+                <w:sz w:val="20"/>
+                <w:szCs w:val="20"/>
+              </w:rPr>
+              <w:t xml:space="preserve">donor1@demo.test</w:t>
+            </w:r>
+          </w:p>
+        </w:tc>
+        <w:tc>
+          <w:tcPr>
+            <w:tcW w:type="dxa" w:w="1400"/>
+            <w:tcBorders>
+              <w:top w:val="single" w:color="CCCCCC" w:sz="4"/>
+              <w:left w:val="single" w:color="CCCCCC" w:sz="4"/>
+              <w:bottom w:val="single" w:color="CCCCCC" w:sz="4"/>
+              <w:right w:val="single" w:color="CCCCCC" w:sz="4"/>
+            </w:tcBorders>
+            <w:tcMar>
+              <w:top w:type="dxa" w:w="100"/>
+              <w:left w:type="dxa" w:w="160"/>
+              <w:bottom w:type="dxa" w:w="100"/>
+              <w:right w:type="dxa" w:w="160"/>
+            </w:tcMar>
+          </w:tcPr>
+          <w:p>
+            <w:r>
+              <w:rPr>
+                <w:rFonts w:ascii="Courier New" w:cs="Courier New" w:eastAsia="Courier New" w:hAnsi="Courier New"/>
+                <w:sz w:val="20"/>
+                <w:szCs w:val="20"/>
+              </w:rPr>
+              <w:t xml:space="preserve">Donor@123</w:t>
+            </w:r>
+          </w:p>
+        </w:tc>
+        <w:tc>
+          <w:tcPr>
+            <w:tcW w:type="dxa" w:w="2200"/>
+            <w:tcBorders>
+              <w:top w:val="single" w:color="CCCCCC" w:sz="4"/>
+              <w:left w:val="single" w:color="CCCCCC" w:sz="4"/>
+              <w:bottom w:val="single" w:color="CCCCCC" w:sz="4"/>
+              <w:right w:val="single" w:color="CCCCCC" w:sz="4"/>
+            </w:tcBorders>
+            <w:tcMar>
+              <w:top w:type="dxa" w:w="100"/>
+              <w:left w:type="dxa" w:w="160"/>
+              <w:bottom w:type="dxa" w:w="100"/>
+              <w:right w:type="dxa" w:w="160"/>
+            </w:tcMar>
+          </w:tcPr>
+          <w:p>
+            <w:r>
+              <w:rPr>
+                <w:rFonts w:ascii="Arial" w:cs="Arial" w:eastAsia="Arial" w:hAnsi="Arial"/>
+                <w:sz w:val="20"/>
+                <w:szCs w:val="20"/>
+              </w:rPr>
+              <w:t xml:space="preserve">donor</w:t>
+            </w:r>
+          </w:p>
+        </w:tc>
+        <w:tc>
+          <w:tcPr>
+            <w:tcW w:type="dxa" w:w="2000"/>
+            <w:tcBorders>
+              <w:top w:val="single" w:color="CCCCCC" w:sz="4"/>
+              <w:left w:val="single" w:color="CCCCCC" w:sz="4"/>
+              <w:bottom w:val="single" w:color="CCCCCC" w:sz="4"/>
+              <w:right w:val="single" w:color="CCCCCC" w:sz="4"/>
+            </w:tcBorders>
+            <w:tcMar>
+              <w:top w:type="dxa" w:w="100"/>
+              <w:left w:type="dxa" w:w="160"/>
+              <w:bottom w:type="dxa" w:w="100"/>
+              <w:right w:type="dxa" w:w="160"/>
+            </w:tcMar>
+          </w:tcPr>
+          <w:p>
+            <w:r>
+              <w:rPr>
+                <w:rFonts w:ascii="Arial" w:cs="Arial" w:eastAsia="Arial" w:hAnsi="Arial"/>
+                <w:sz w:val="20"/>
+                <w:szCs w:val="20"/>
+              </w:rPr>
+              <w:t xml:space="preserve">donor-1</w:t>
+            </w:r>
+          </w:p>
+        </w:tc>
+      </w:tr>
+    </w:tbl>
+    <w:p>
+      <w:r>
+        <w:rPr>
+          <w:sz w:val="22"/>
+          <w:szCs w:val="22"/>
+        </w:rPr>
+        <w:t xml:space="preserve"/>
+      </w:r>
+    </w:p>
+    <w:p>
+      <w:pPr>
+        <w:pStyle w:val="Heading2"/>
+      </w:pPr>
+      <w:r>
+        <w:rPr>
+          <w:b/>
+          <w:bCs/>
+          <w:sz w:val="26"/>
+          <w:szCs w:val="26"/>
+        </w:rPr>
+        <w:t xml:space="preserve">Pembaruan terbaru</w:t>
+      </w:r>
+    </w:p>
+    <w:p>
+      <w:pPr>
+        <w:pStyle w:val="ListParagraph"/>
+        <w:numPr>
+          <w:ilvl w:val="0"/>
+          <w:numId w:val="2"/>
+        </w:numPr>
+      </w:pPr>
+      <w:r>
+        <w:rPr>
+          <w:sz w:val="22"/>
+          <w:szCs w:val="22"/>
+        </w:rPr>
+        <w:t xml:space="preserve">Google OAuth 2.0 sign-in diaktifkan. User yang login via Google otomatis mendapat record donor + linkedId tanpa harus mengisi ulang form registrasi.</w:t>
+      </w:r>
+    </w:p>
+    <w:p>
+      <w:pPr>
+        <w:pStyle w:val="ListParagraph"/>
+        <w:numPr>
+          <w:ilvl w:val="0"/>
+          <w:numId w:val="2"/>
+        </w:numPr>
+      </w:pPr>
+      <w:r>
+        <w:rPr>
+          <w:sz w:val="22"/>
+          <w:szCs w:val="22"/>
+        </w:rPr>
+        <w:t xml:space="preserve">Donor dashboard memiliki fallback auto-provisioning bagi user Google legacy yang sudah login sebelum fitur auto-provision ada — idempotent, dipanggil hanya jika linkedId kosong.</w:t>
+      </w:r>
+    </w:p>
+    <w:p>
+      <w:pPr>
+        <w:pStyle w:val="ListParagraph"/>
+        <w:numPr>
+          <w:ilvl w:val="0"/>
+          <w:numId w:val="2"/>
+        </w:numPr>
+      </w:pPr>
+      <w:r>
+        <w:rPr>
+          <w:sz w:val="22"/>
+          <w:szCs w:val="22"/>
+        </w:rPr>
+        <w:t xml:space="preserve">Seluruh 17 skenario evidence dalam laporan ini di-capture langsung dari endpoint production (https://alp-cybersecurity.vercel.app), bukan dari localhost.</w:t>
+      </w:r>
     </w:p>
     <w:p>
       <w:r>

</xml_diff>